<commit_message>
Phase 2 Complete: Implemented GetMenusByUser REST API & RBAC dynamic screen navigation in Passenger_uni, seeded mobileappmenu tables, and updated proposal documents
</commit_message>
<xml_diff>
--- a/important files from manger/database_schema_design.docx
+++ b/important files from manger/database_schema_design.docx
@@ -82,7 +82,7 @@
         <w:t xml:space="preserve">Roles: </w:t>
       </w:r>
       <w:r>
-        <w:t>Existing master roles table.</w:t>
+        <w:t>Existing master roles table containing passenger_default (ID 176) and passenger_account_manager (ID 177).</w:t>
       </w:r>
     </w:p>
     <w:p>
@@ -873,7 +873,7 @@
         <w:rPr>
           <w:b/>
         </w:rPr>
-        <w:t>Table 2: Roles (Master Roles)</w:t>
+        <w:t>Table 2: Roles (Master Passenger Roles)</w:t>
       </w:r>
     </w:p>
     <w:tbl>
@@ -958,7 +958,7 @@
           </w:tcPr>
           <w:p>
             <w:r>
-              <w:t>1</w:t>
+              <w:t>176</w:t>
             </w:r>
           </w:p>
         </w:tc>
@@ -969,7 +969,7 @@
           </w:tcPr>
           <w:p>
             <w:r>
-              <w:t>default_user</w:t>
+              <w:t>passenger_default</w:t>
             </w:r>
           </w:p>
         </w:tc>
@@ -980,7 +980,7 @@
           </w:tcPr>
           <w:p>
             <w:r>
-              <w:t>Menu</w:t>
+              <w:t>MobileAppMenu</w:t>
             </w:r>
           </w:p>
         </w:tc>
@@ -1003,7 +1003,7 @@
           </w:tcPr>
           <w:p>
             <w:r>
-              <w:t>2</w:t>
+              <w:t>177</w:t>
             </w:r>
           </w:p>
         </w:tc>
@@ -1013,7 +1013,7 @@
           </w:tcPr>
           <w:p>
             <w:r>
-              <w:t>account_manager</w:t>
+              <w:t>passenger_account_manager</w:t>
             </w:r>
           </w:p>
         </w:tc>
@@ -1023,7 +1023,7 @@
           </w:tcPr>
           <w:p>
             <w:r>
-              <w:t>Menu</w:t>
+              <w:t>MobileAppMenu</w:t>
             </w:r>
           </w:p>
         </w:tc>
@@ -1152,7 +1152,7 @@
           </w:tcPr>
           <w:p>
             <w:r>
-              <w:t>1 (default_user)</w:t>
+              <w:t>176 (passenger_default)</w:t>
             </w:r>
           </w:p>
         </w:tc>
@@ -1195,7 +1195,7 @@
           </w:tcPr>
           <w:p>
             <w:r>
-              <w:t>1 (default_user)</w:t>
+              <w:t>176 (passenger_default)</w:t>
             </w:r>
           </w:p>
         </w:tc>
@@ -1240,7 +1240,7 @@
           </w:tcPr>
           <w:p>
             <w:r>
-              <w:t>2 (account_manager)</w:t>
+              <w:t>177 (passenger_account_manager)</w:t>
             </w:r>
           </w:p>
         </w:tc>
@@ -1368,9 +1368,9 @@
         <w:br/>
         <w:t>INSERT INTO Roles (ID, RoleName, RoleType) VALUES</w:t>
         <w:br/>
-        <w:t>(1, 'default_user', 'Menu'),</w:t>
+        <w:t>(176, 'passenger_default', 'MobileAppMenu'),</w:t>
         <w:br/>
-        <w:t>(2, 'account_manager', 'Menu')</w:t>
+        <w:t>(177, 'passenger_account_manager', 'MobileAppMenu')</w:t>
         <w:br/>
         <w:t>ON DUPLICATE KEY UPDATE RoleName=VALUES(RoleName);</w:t>
         <w:br/>
@@ -1410,9 +1410,9 @@
         <w:br/>
         <w:t>INSERT INTO mobileappmenuinroles (MobileAppMenuId, RoleId) VALUES</w:t>
         <w:br/>
-        <w:t>(501, 1), (503, 1), (507, 1), (508, 1), (509, 1), (510, 1), (511, 1), (512, 1),</w:t>
+        <w:t>(501, 176), (503, 176), (507, 176), (508, 176), (509, 176), (510, 176), (511, 176), (512, 176),</w:t>
         <w:br/>
-        <w:t>(501, 2), (502, 2), (503, 2), (504, 2), (505, 2), (506, 2), (507, 2), (508, 2), (509, 2), (510, 2), (511, 2), (512, 2);</w:t>
+        <w:t>(501, 177), (502, 177), (503, 177), (504, 177), (505, 177), (506, 177), (507, 177), (508, 177), (509, 177), (510, 177), (511, 177), (512, 177);</w:t>
       </w:r>
     </w:p>
     <w:p>

</xml_diff>